<commit_message>
Prevent material text from entering question prompts
</commit_message>
<xml_diff>
--- a/reports/final_deliverables/必修四哲学_Codex补全修正版_2026-04-29/outputs/2026北京高考政治哲学宝典_Codex补全版_学生版.docx
+++ b/reports/final_deliverables/必修四哲学_Codex补全修正版_2026-04-29/outputs/2026北京高考政治哲学宝典_Codex补全版_学生版.docx
@@ -487,7 +487,7 @@
         <w:t>【设问】</w:t>
       </w:r>
       <w:r>
-        <w:t xml:space="preserve"> 纵观整个人类发展史，凡是社会大发展、大变革的时代，也是人文学科推陈出新的时代，比如我国春秋战国时期的百家争鸣、西方的文艺复兴等。当前，面对技术进步带来的社会巨变，人们迫切需要为这个充满机遇与挑战的时代注入新的思想活力。人工智能可以完成写作、翻译、分析信息等工作，人文学科能教人如何辨析价值冲突。技术再进步，“人何以为人”的思考永不过时。技术可以模拟语言，却未必理解语言背后的情感；算法可以识别图像，却无法体验图像所承载的历史记忆。当我们拥有足够的历史意识、伦理意识和文化理解时，技术才能真正成为文明进步的工具，而不是新的风险来源。人工智能为我们赋能，人文学科为人工智能赋魂。 有人说，人文学科在人工智能时代具有不可替代的价值。结合材料，运用《哲学与文化》知识，谈谈对这一观点的认识。</w:t>
+        <w:t xml:space="preserve"> 有人说，人文学科在人工智能时代具有不可替代的价值。结合材料，运用《哲学与文化》知识，谈谈对这一观点的认识。</w:t>
       </w:r>
     </w:p>
     <w:p>
@@ -1199,7 +1199,7 @@
         <w:t>【设问】</w:t>
       </w:r>
       <w:r>
-        <w:t xml:space="preserve"> 材料一：某地作为亚欧黄金通道和向西开放的桥头堡，是全国能源资源战略保障基地、全国优质农牧产品重要供给基地、维护国家地缘安全的战略屏障。该地依托区位优势，推进口岸数字化转型和智能化升级，建设清洁能源基地，促进草原畜牧业转型升级，举办“中外文化展示周”等系列文化活动，鼓励因地制宜发展乡村休闲旅游、民宿、丰收市集等新业态新模式。 材料二：因地制宜，本质就是实事求是。推进高质量发展没有“一招鲜”，否则就会出现“千城一面”、盲目内卷。扶贫要实事求是，因地制宜；乡村振兴要因村制宜，精准施策；生态治理要宜林则林、宜草则草、宜沙则沙、宜荒则荒；区域协调发展要宜水则水、宜山则山，宜粮则粮，宜农则农，宜工则工、宜商则商。 结合材料一和材料二，运用哲学知识，谈谈你对“因地制宜，本质就是实事求是”的理解。（7分）。</w:t>
+        <w:t xml:space="preserve"> 结合材料一和材料二，运用哲学知识，谈谈你对“因地制宜，本质就是实事求是”的理解。（7分）。</w:t>
       </w:r>
     </w:p>
     <w:p>
@@ -4749,7 +4749,7 @@
         <w:t>【设问】</w:t>
       </w:r>
       <w:r>
-        <w:t xml:space="preserve"> 东城区前门街道草厂地区有一个远近闻名的“小院议事厅”。“小院议事厅”在社区党委的领导下，组织居民会议、召开恳谈会、举办议事会，探索出协商共治的“五民工作法”——民事民提、民事民议、民事民决、民事民办、民事民评。街道围着社区转，社区围着小院转，小院围着居民转，通过多方参与形成合力，有效解决了垃圾分类、院落改善、文明养犬等难点问题，大大增强了社区居民的获得感和幸福感，促进了居民自治与社区精细治理的有效结合。从最开始坐在胡同口的小板凳上商量事儿，到现在有了专门议事的空间，很多邻里之间的矛盾事儿、社区里的治理难题，就这样在“唠家常”中解决了。结合材料，分析“五民工作法”对我国发展基层民主的启示。</w:t>
+        <w:t xml:space="preserve"> 结合材料，分析“五民工作法”对我国发展基层民主的启示。</w:t>
       </w:r>
     </w:p>
     <w:p>
@@ -5005,7 +5005,7 @@
         <w:t>【设问】</w:t>
       </w:r>
       <w:r>
-        <w:t xml:space="preserve"> 传统产业在我国制造业中占比超80%，是现代化产业体系的基底。多年来，我国轻工、纺织、机械等传统产业带动效应强、产业关联度大、国际市场占有率高，是我国参与国际竞争的生力军。但也存在低端产能过剩、高端供给不足、产业基础不牢、创新能力薄弱等问题，对数字化、智能化有着庞大、迫切的实际需求。当前，从人形机器人到量子计算机，从脑机接口到6G网络设备，中国未来产业正在科技新赛道上加速前进。未来材料、未来网络等能够广泛渗透传统产业链上下游各个环节，引领传统优势产业高端化、智能化、绿色化转型。（3）发展新质生产力，要正确认识传统产业和未来产业的关系。结合材料，运用《逻辑与思维》知识，谈谈你的看法。</w:t>
+        <w:t xml:space="preserve"> 结合材料，运用《逻辑与思维》知识，谈谈你的看法。</w:t>
       </w:r>
     </w:p>
     <w:p>
@@ -6229,7 +6229,7 @@
         <w:t>【设问】</w:t>
       </w:r>
       <w:r>
-        <w:t xml:space="preserve"> 纵观整个人类发展史，凡是社会大发展、大变革的时代，也是人文学科推陈出新的时代，比如我国春秋战国时期的百家争鸣、西方的文艺复兴等。当前，面对技术进步带来的社会巨变，人们迫切需要为这个充满机遇与挑战的时代注入新的思想活力。人工智能可以完成写作、翻译、分析信息等工作，人文学科能教人如何辨析价值冲突。技术再进步，“人何以为人”的思考永不过时。技术可以模拟语言，却未必理解语言背后的情感；算法可以识别图像，却无法体验图像所承载的历史记忆。当我们拥有足够的历史意识、伦理意识和文化理解时，技术才能真正成为文明进步的工具，而不是新的风险来源。人工智能为我们赋能，人文学科为人工智能赋魂。 有人说，人文学科在人工智能时代具有不可替代的价值。结合材料，运用《哲学与文化》知识，谈谈对这一观点的认识。</w:t>
+        <w:t xml:space="preserve"> 有人说，人文学科在人工智能时代具有不可替代的价值。结合材料，运用《哲学与文化》知识，谈谈对这一观点的认识。</w:t>
       </w:r>
     </w:p>
     <w:p>
@@ -6613,7 +6613,7 @@
         <w:t>【设问】</w:t>
       </w:r>
       <w:r>
-        <w:t xml:space="preserve"> 传统产业在我国制造业中占比超80%，是现代化产业体系的基底。多年来，我国轻工、纺织、机械等传统产业带动效应强、产业关联度大、国际市场占有率高，是我国参与国际竞争的生力军。但也存在低端产能过剩、高端供给不足、产业基础不牢、创新能力薄弱等问题，对数字化、智能化有着庞大、迫切的实际需求。当前，从人形机器人到量子计算机，从脑机接口到6G网络设备，中国未来产业正在科技新赛道上加速前进。未来材料、未来网络等能够广泛渗透传统产业链上下游各个环节，引领传统优势产业高端化、智能化、绿色化转型。（3）发展新质生产力，要正确认识传统产业和未来产业的关系。结合材料，运用《逻辑与思维》知识，谈谈你的看法。</w:t>
+        <w:t xml:space="preserve"> 结合材料，运用《逻辑与思维》知识，谈谈你的看法。</w:t>
       </w:r>
     </w:p>
     <w:p>
@@ -8477,7 +8477,7 @@
         <w:t>【设问】</w:t>
       </w:r>
       <w:r>
-        <w:t xml:space="preserve"> 对长期主义，中国人有个更生动的表达——“坚持就是胜利”。“路漫漫其修远兮，吾将上下而求索”“凿井者，起于三寸之坎，以就万仞之深”……这些名句，穿越时空，成为一代代国人的座右铭。认准了就坚定不移干。一年不行就十年，十年不行就二十年、三十年。一代接着一代、一茬接着一茬，日拱一卒。长期主义深植于中华民族的文化基因，也融入了中国共产党治国理政的行动哲学。新中国成立以来，从“一五”到“十四五”，一个又一个紧密接续的“五年规划”，就是在以长期主义的理念不断推进中国式现代化。从“两弹一星”到载人航天，从复兴号到C919，从塔里木沙漠公路到港珠澳跨海大桥……回望发展历程，许多领域的惊艳成果，都源自几十年如一日的坚守，源自看准了就坚定不移干的执着。“坚持长期主义，做困难而正确的事”，结合材料，综合运用所学，谈谈你对这句话的理解。</w:t>
+        <w:t xml:space="preserve"> “坚持长期主义，做困难而正确的事”，结合材料，综合运用所学，谈谈你对这句话的理解。</w:t>
       </w:r>
     </w:p>
     <w:p>
@@ -8813,7 +8813,7 @@
         <w:t>【设问】</w:t>
       </w:r>
       <w:r>
-        <w:t xml:space="preserve"> 传统产业在我国制造业中占比超80%，是现代化产业体系的基底。多年来，我国轻工、纺织、机械等传统产业带动效应强、产业关联度大、国际市场占有率高，是我国参与国际竞争的生力军。但也存在低端产能过剩、高端供给不足、产业基础不牢、创新能力薄弱等问题，对数字化、智能化有着庞大、迫切的实际需求。当前，从人形机器人到量子计算机，从脑机接口到6G网络设备，中国未来产业正在科技新赛道上加速前进。未来材料、未来网络等能够广泛渗透传统产业链上下游各个环节，引领传统优势产业高端化、智能化、绿色化转型。（3）发展新质生产力，要正确认识传统产业和未来产业的关系。结合材料，运用《逻辑与思维》知识，谈谈你的看法。</w:t>
+        <w:t xml:space="preserve"> 结合材料，运用《逻辑与思维》知识，谈谈你的看法。</w:t>
       </w:r>
     </w:p>
     <w:p>
@@ -9197,7 +9197,7 @@
         <w:t>【设问】</w:t>
       </w:r>
       <w:r>
-        <w:t xml:space="preserve"> 都江堰，这座全世界迄今唯一仍在使用的古代水利工程，是人类与自然和谐共生最早的成功实践之一。战国时期，秦国蜀郡太守李冰利用当地西北高、东南低的地理条件，率领民众历经艰难、勇于开拓，修建都江堰，治水利民，充分彰显了“因地制宜、顺势而为、天人合一”的传统理念。都江堰的修建并非一蹴而就，历代治水者接力维护，使其千年至今仍焕发生机。如今，建设者守正创新，迈入“智水”时代，构建智慧水资源保护与污染防治体系、科技赋能文物保护等，推动工程持续升级。同时创新放水节文化表达，以情景剧演绎“李冰治水”故事，增设游客互动体验项目，让治水文化可触可感，为都江堰世界文化遗产的可持续发展注入智慧力量。结合材料，运用《哲学与文化》知识，阐释都江堰跨越千年的治水智慧。</w:t>
+        <w:t xml:space="preserve"> 结合材料，运用《哲学与文化》知识，阐释都江堰跨越千年的治水智慧。</w:t>
       </w:r>
     </w:p>
     <w:p>
@@ -10365,7 +10365,7 @@
         <w:t>【设问】</w:t>
       </w:r>
       <w:r>
-        <w:t xml:space="preserve"> 人工智能正以前所未有的速度融入社会生活。AI 辅助修复壁画，让文物延寿千载；数字创作让诗词书画、传统技艺焕发新生；智能翻译推动跨文化交流，智慧政务、智慧医疗让生活更加便捷高效……人工智能为人类文明进步注入强劲动能。与此同时，人工智能的广泛应用也带来了风险与隐忧。AI 深度伪造篡改历史影像、生成虚假新闻造成信息失真；算法推荐窄化文化视野、消解文化多样性；“智能鸿沟”问题日益凸显，老年人、农村群体、偏远地区群众因数字技能不足被排斥在智能服务之外。 如何以哲学智慧指引方向，以人文精神守护底线，推动人工智能朝着有益、安全、公平方向健康发展，是当代青年必须思考的时代命题。结合材料，运用《哲学与文化》知识，谈谈你对这一时代命题的思考。</w:t>
+        <w:t xml:space="preserve"> 结合材料，运用《哲学与文化》知识，谈谈你对这一时代命题的思考。</w:t>
       </w:r>
     </w:p>
     <w:p>
@@ -10565,7 +10565,7 @@
         <w:t>【设问】</w:t>
       </w:r>
       <w:r>
-        <w:t xml:space="preserve"> 东城区前门街道草厂地区有一个远近闻名的“小院议事厅”。“小院议事厅”在社区党委的领导下，组织居民会议、召开恳谈会、举办议事会，探索出协商共治的“五民工作法”——民事民提、民事民议、民事民决、民事民办、民事民评。街道围着社区转，社区围着小院转，小院围着居民转，通过多方参与形成合力，有效解决了垃圾分类、院落改善、文明养犬等难点问题，大大增强了社区居民的获得感和幸福感，促进了居民自治与社区精细治理的有效结合。从最开始坐在胡同口的小板凳上商量事儿，到现在有了专门议事的空间，很多邻里之间的矛盾事儿、社区里的治理难题，就这样在“唠家常”中解决了。结合材料，分析“五民工作法”对我国发展基层民主的启示。</w:t>
+        <w:t xml:space="preserve"> 结合材料，分析“五民工作法”对我国发展基层民主的启示。</w:t>
       </w:r>
     </w:p>
     <w:p>
@@ -10757,7 +10757,7 @@
         <w:t>【设问】</w:t>
       </w:r>
       <w:r>
-        <w:t xml:space="preserve"> 人与自然是生命共同体，要像保护眼睛一样保护自然和生态环境。材料一：蓝天成为常态是看得见的幸福，成为首都老百姓最有获得感的一件事。2025年全市空气质量优良天数达348天，优良天数比例近95%，实现了从“雾霾困扰”到“常态蓝天”的转变。治理路径包括：系统治理，统筹产业、能源、交通、用地四大结构调整，推进工业减排、机动车清洁化、扬尘精细化管控、散煤清零、多污染物协同控制；精准施策，聚焦重点区域、重点行业、重点时段，分区分类、一企一策，避免“一刀切”；久久为功，一茬接着一茬干，以日积月累的治理行动，持续治理推动空气质量稳步提升。 结合材料一，运用辩证思维方法，分析北京是如何通过科学治理实现“常态蓝天”的。（6分）。</w:t>
+        <w:t xml:space="preserve"> 结合材料一，运用辩证思维方法，分析北京是如何通过科学治理实现“常态蓝天”的。（6分）。</w:t>
       </w:r>
     </w:p>
     <w:p>
@@ -12381,7 +12381,7 @@
         <w:t>【设问】</w:t>
       </w:r>
       <w:r>
-        <w:t xml:space="preserve"> 中华优秀传统文化在新时代绽放新光彩。国产动画电影持续实现票房和口碑双丰收。《长安三万里》引发了全国上下的唐诗热、传统文化热，钩沉出绵延千年的中华文明的独特魅力；《哪吒之魔童闹海》的创作团队依托中国电影视效技术，精心雕琢每一个细节，取得突破性成果；在一位导演看来，国产动画电影取得成功并非偶然：“随着中国经济社会的发展，当人民群众的艺术生活需求达到一定阶段的时候，自然会有这么大的市场来承载这样的作品，来包容这样的创作者。”“我们遇上了一个好时代，所以才有这样的机会去做自己喜欢的事，去心无旁骛地投入创作，最终还能得到相应的回报。” 结合材料，运用《哲学与文化》知识，说明为什么国产动画电影能够让中华优秀传统文化在新时代绽放新光彩。</w:t>
+        <w:t xml:space="preserve"> ” 结合材料，运用《哲学与文化》知识，说明为什么国产动画电影能够让中华优秀传统文化在新时代绽放新光彩。</w:t>
       </w:r>
     </w:p>
     <w:p>
@@ -12461,7 +12461,7 @@
         <w:t>【设问】</w:t>
       </w:r>
       <w:r>
-        <w:t xml:space="preserve"> 破与立，是中华优秀传统文化中关于事物变革创新的一对关系，蕴含着破立并举、革故鼎新的先贤智慧。新中国成立后，党带领人民破立结合、循序渐进，建立起社会主义制度；改革开放之初，党带领人民边破边立、先行先试，改革从农村到城市、从沿海到内地渐次铺开；党的十八大以来，党带领人民破立并举、先立后破，开创了改革开放全新局面。当前，进一步全面深化改革已经进入攻坚期和深水区，党带领人民坚守志不改、道不变的信念，锚定进一步全面深化改革总目标，坚持“不立不破、先立后破”的发展之道：立新发展格局，破传统发展路径依赖；立新质生产力，破原始创新能力不强；立清风正气，破“四风”顽疾；立公正高效权威的司法制度，破影响司法公正之弊，推动各项制度更加成熟和定型，改革不断取得令人民满意的新成效。结合材料，综合运用所学，阐述我们党在进一步全面深化改革中统筹破立关系，对全面建成社会主义现代化强国的重要意义。</w:t>
+        <w:t xml:space="preserve"> 结合材料，综合运用所学，阐述我们党在进一步全面深化改革中统筹破立关系，对全面建成社会主义现代化强国的重要意义。</w:t>
       </w:r>
     </w:p>
     <w:p>
@@ -12533,7 +12533,7 @@
         <w:t>【设问】</w:t>
       </w:r>
       <w:r>
-        <w:t xml:space="preserve"> 东城区前门街道草厂地区有一个远近闻名的“小院议事厅”。“小院议事厅”在社区党委的领导下，组织居民会议、召开恳谈会、举办议事会，探索出协商共治的“五民工作法”——民事民提、民事民议、民事民决、民事民办、民事民评。街道围着社区转，社区围着小院转，小院围着居民转，通过多方参与形成合力，有效解决了垃圾分类、院落改善、文明养犬等难点问题，大大增强了社区居民的获得感和幸福感，促进了居民自治与社区精细治理的有效结合。从最开始坐在胡同口的小板凳上商量事儿，到现在有了专门议事的空间，很多邻里之间的矛盾事儿、社区里的治理难题，就这样在“唠家常”中解决了。结合材料，分析“五民工作法”对我国发展基层民主的启示。</w:t>
+        <w:t xml:space="preserve"> 结合材料，分析“五民工作法”对我国发展基层民主的启示。</w:t>
       </w:r>
     </w:p>
     <w:p>
@@ -13517,7 +13517,7 @@
         <w:t>【设问】</w:t>
       </w:r>
       <w:r>
-        <w:t xml:space="preserve"> 对长期主义，中国人有个更生动的表达——“坚持就是胜利”。“路漫漫其修远兮，吾将上下而求索”“凿井者，起于三寸之坎，以就万仞之深”……这些名句，穿越时空，成为一代代国人的座右铭。认准了就坚定不移干。一年不行就十年，十年不行就二十年、三十年。一代接着一代、一茬接着一茬，日拱一卒。长期主义深植于中华民族的文化基因，也融入了中国共产党治国理政的行动哲学。新中国成立以来，从“一五”到“十四五”，一个又一个紧密接续的“五年规划”，就是在以长期主义的理念不断推进中国式现代化。从“两弹一星”到载人航天，从复兴号到C919，从塔里木沙漠公路到港珠澳跨海大桥……回望发展历程，许多领域的惊艳成果，都源自几十年如一日的坚守，源自看准了就坚定不移干的执着。“坚持长期主义，做困难而正确的事”，结合材料，综合运用所学，谈谈你对这句话的理解。</w:t>
+        <w:t xml:space="preserve"> “坚持长期主义，做困难而正确的事”，结合材料，综合运用所学，谈谈你对这句话的理解。</w:t>
       </w:r>
     </w:p>
     <w:p>
@@ -17773,7 +17773,7 @@
         <w:t>【设问】</w:t>
       </w:r>
       <w:r>
-        <w:t xml:space="preserve"> 对长期主义，中国人有个更生动的表达——“坚持就是胜利”。“路漫漫其修远兮，吾将上下而求索”“凿井者，起于三寸之坎，以就万仞之深”……这些名句，穿越时空，成为一代代国人的座右铭。认准了就坚定不移干。一年不行就十年，十年不行就二十年、三十年。一代接着一代、一茬接着一茬，日拱一卒。长期主义深植于中华民族的文化基因，也融入了中国共产党治国理政的行动哲学。新中国成立以来，从“一五”到“十四五”，一个又一个紧密接续的“五年规划”，就是在以长期主义的理念不断推进中国式现代化。从“两弹一星”到载人航天，从复兴号到C919，从塔里木沙漠公路到港珠澳跨海大桥……回望发展历程，许多领域的惊艳成果，都源自几十年如一日的坚守，源自看准了就坚定不移干的执着。“坚持长期主义，做困难而正确的事”，结合材料，综合运用所学，谈谈你对这句话的理解。</w:t>
+        <w:t xml:space="preserve"> “坚持长期主义，做困难而正确的事”，结合材料，综合运用所学，谈谈你对这句话的理解。</w:t>
       </w:r>
     </w:p>
     <w:p>

</xml_diff>

<commit_message>
Tighten Haidian Q16 material trigger
</commit_message>
<xml_diff>
--- a/reports/final_deliverables/必修四哲学_Codex补全修正版_2026-04-29/outputs/2026北京高考政治哲学宝典_Codex补全版_学生版.docx
+++ b/reports/final_deliverables/必修四哲学_Codex补全修正版_2026-04-29/outputs/2026北京高考政治哲学宝典_Codex补全版_学生版.docx
@@ -473,7 +473,7 @@
         <w:t>【材料触发点】</w:t>
       </w:r>
       <w:r>
-        <w:t xml:space="preserve"> 材料把人文学科的价值放在人工智能快速发展的客观时代背景中说明：不是主观想保留人文学科，而是技术进步、社会巨变和人工智能局限共同构成了客观现实。</w:t>
+        <w:t xml:space="preserve"> 材料先说“社会大发展、大变革的时代，也是人文学科推陈出新的时代”，并举春秋战国百家争鸣、西方文艺复兴为例；随后把人工智能时代也写成技术进步带来的社会巨变。</w:t>
       </w:r>
     </w:p>
     <w:p>
@@ -501,7 +501,7 @@
         <w:t>【为什么能想到】</w:t>
       </w:r>
       <w:r>
-        <w:t xml:space="preserve"> 设问问“人文学科为什么不可替代”，关键是先看人工智能时代的客观现实：技术条件和社会生活方式已经发生变化，人工智能能处理信息却不能处理价值、情感和历史理解。正是这些客观变化和客观局限，决定了人们必须重新认识并需要人文学科。</w:t>
+        <w:t xml:space="preserve"> 能想到物质决定意识，是因为材料先用春秋战国百家争鸣、文艺复兴说明“社会大发展、大变革”会推动人文学科推陈出新；再写今天人工智能带来新的社会巨变。这个材料逻辑就是：客观时代变革提出新的价值冲突、情感理解和历史记忆问题，决定人们必须重新认识人文学科的必要性。</w:t>
       </w:r>
     </w:p>
     <w:p>

</xml_diff>